<commit_message>
docs: cerrar fase 9 de matrices de riesgos
</commit_message>
<xml_diff>
--- a/docs/3. Módulo Matrices de Riesgos/Fase 9 - Reporteria mapa de calor y exportaciones/Fase_9_Reporteria_Mapa_Calor_Exportaciones_Matrices_Riesgos_SGRLA_IHSS.docx
+++ b/docs/3. Módulo Matrices de Riesgos/Fase 9 - Reporteria mapa de calor y exportaciones/Fase_9_Reporteria_Mapa_Calor_Exportaciones_Matrices_Riesgos_SGRLA_IHSS.docx
@@ -7,6 +7,9 @@
         <w:jc w:val="center"/>
       </w:pPr>
       <w:r>
+        <w:rPr>
+          <w:rFonts w:ascii="Arial" w:hAnsi="Arial"/>
+        </w:rPr>
         <w:t>Fase 9. Reportería, Mapa de Calor y Exportaciones</w:t>
       </w:r>
     </w:p>
@@ -15,6 +18,9 @@
         <w:jc w:val="center"/>
       </w:pPr>
       <w:r>
+        <w:rPr>
+          <w:rFonts w:ascii="Arial" w:hAnsi="Arial"/>
+        </w:rPr>
         <w:t>Módulo 3. Matrices de Riesgos - SGRLA/FT IHSS</w:t>
       </w:r>
     </w:p>
@@ -23,13 +29,17 @@
         <w:jc w:val="center"/>
       </w:pPr>
       <w:r>
-        <w:t>Documento técnico para validación funcional y técnica</w:t>
+        <w:rPr>
+          <w:rFonts w:ascii="Arial" w:hAnsi="Arial"/>
+          <w:sz w:val="20"/>
+        </w:rPr>
+        <w:t>Documento técnico aprobado y cerrado</w:t>
         <w:br/>
         <w:t>Responsable: Javier Mejía</w:t>
         <w:br/>
-        <w:t>Versión: 1.0</w:t>
+        <w:t>Versión: 1.1</w:t>
         <w:br/>
-        <w:t>Estado: Implementación técnica inicial de Fase 9 para revisión</w:t>
+        <w:t>Estado: Fase 9 aprobada y cerrada por autorización formal de Javier Mejía</w:t>
       </w:r>
     </w:p>
     <w:p>
@@ -37,6 +47,9 @@
         <w:pStyle w:val="Heading1"/>
       </w:pPr>
       <w:r>
+        <w:rPr>
+          <w:rFonts w:ascii="Arial" w:hAnsi="Arial"/>
+        </w:rPr>
         <w:t>1. Control de versión</w:t>
       </w:r>
     </w:p>
@@ -59,10 +72,16 @@
           <w:tcPr>
             <w:tcW w:type="dxa" w:w="1008"/>
             <w:vAlign w:val="center"/>
-            <w:shd w:fill="F2F4F7"/>
+            <w:shd w:fill="D9E2F3"/>
           </w:tcPr>
           <w:p>
             <w:r>
+              <w:rPr>
+                <w:rFonts w:ascii="Arial" w:hAnsi="Arial"/>
+                <w:b/>
+                <w:color w:val="0F172A"/>
+                <w:sz w:val="18"/>
+              </w:rPr>
               <w:t>Versión</w:t>
             </w:r>
           </w:p>
@@ -71,13 +90,22 @@
           <w:tcPr>
             <w:tcW w:type="dxa" w:w="1440"/>
             <w:vAlign w:val="center"/>
-            <w:shd w:fill="F2F4F7"/>
+            <w:shd w:fill="D9E2F3"/>
           </w:tcPr>
           <w:p>
-            <w:r/>
             <w:r>
               <w:rPr>
+                <w:rFonts w:ascii="Arial" w:hAnsi="Arial"/>
                 <w:b/>
+                <w:color w:val="0F172A"/>
+                <w:sz w:val="18"/>
+              </w:rPr>
+            </w:r>
+            <w:r>
+              <w:rPr>
+                <w:rFonts w:ascii="Arial" w:hAnsi="Arial"/>
+                <w:b/>
+                <w:color w:val="0F172A"/>
                 <w:sz w:val="18"/>
               </w:rPr>
               <w:t>Fecha</w:t>
@@ -88,13 +116,22 @@
           <w:tcPr>
             <w:tcW w:type="dxa" w:w="1728"/>
             <w:vAlign w:val="center"/>
-            <w:shd w:fill="F2F4F7"/>
+            <w:shd w:fill="D9E2F3"/>
           </w:tcPr>
           <w:p>
-            <w:r/>
             <w:r>
               <w:rPr>
+                <w:rFonts w:ascii="Arial" w:hAnsi="Arial"/>
                 <w:b/>
+                <w:color w:val="0F172A"/>
+                <w:sz w:val="18"/>
+              </w:rPr>
+            </w:r>
+            <w:r>
+              <w:rPr>
+                <w:rFonts w:ascii="Arial" w:hAnsi="Arial"/>
+                <w:b/>
+                <w:color w:val="0F172A"/>
                 <w:sz w:val="18"/>
               </w:rPr>
               <w:t>Responsable</w:t>
@@ -105,13 +142,22 @@
           <w:tcPr>
             <w:tcW w:type="dxa" w:w="1728"/>
             <w:vAlign w:val="center"/>
-            <w:shd w:fill="F2F4F7"/>
+            <w:shd w:fill="D9E2F3"/>
           </w:tcPr>
           <w:p>
-            <w:r/>
             <w:r>
               <w:rPr>
+                <w:rFonts w:ascii="Arial" w:hAnsi="Arial"/>
                 <w:b/>
+                <w:color w:val="0F172A"/>
+                <w:sz w:val="18"/>
+              </w:rPr>
+            </w:r>
+            <w:r>
+              <w:rPr>
+                <w:rFonts w:ascii="Arial" w:hAnsi="Arial"/>
+                <w:b/>
+                <w:color w:val="0F172A"/>
                 <w:sz w:val="18"/>
               </w:rPr>
               <w:t>Estado</w:t>
@@ -122,10 +168,16 @@
           <w:tcPr>
             <w:tcW w:type="dxa" w:w="3456"/>
             <w:vAlign w:val="center"/>
-            <w:shd w:fill="F2F4F7"/>
+            <w:shd w:fill="D9E2F3"/>
           </w:tcPr>
           <w:p>
             <w:r>
+              <w:rPr>
+                <w:rFonts w:ascii="Arial" w:hAnsi="Arial"/>
+                <w:b/>
+                <w:color w:val="0F172A"/>
+                <w:sz w:val="18"/>
+              </w:rPr>
               <w:t>Descripción</w:t>
             </w:r>
           </w:p>
@@ -138,9 +190,15 @@
             <w:vAlign w:val="center"/>
           </w:tcPr>
           <w:p>
-            <w:r/>
             <w:r>
               <w:rPr>
+                <w:rFonts w:ascii="Arial" w:hAnsi="Arial"/>
+                <w:sz w:val="18"/>
+              </w:rPr>
+            </w:r>
+            <w:r>
+              <w:rPr>
+                <w:rFonts w:ascii="Arial" w:hAnsi="Arial"/>
                 <w:b w:val="0"/>
                 <w:sz w:val="18"/>
               </w:rPr>
@@ -154,9 +212,15 @@
             <w:vAlign w:val="center"/>
           </w:tcPr>
           <w:p>
-            <w:r/>
             <w:r>
               <w:rPr>
+                <w:rFonts w:ascii="Arial" w:hAnsi="Arial"/>
+                <w:sz w:val="18"/>
+              </w:rPr>
+            </w:r>
+            <w:r>
+              <w:rPr>
+                <w:rFonts w:ascii="Arial" w:hAnsi="Arial"/>
                 <w:b w:val="0"/>
                 <w:sz w:val="18"/>
               </w:rPr>
@@ -171,6 +235,10 @@
           </w:tcPr>
           <w:p>
             <w:r>
+              <w:rPr>
+                <w:rFonts w:ascii="Arial" w:hAnsi="Arial"/>
+                <w:sz w:val="18"/>
+              </w:rPr>
               <w:t>Javier Mejía</w:t>
             </w:r>
           </w:p>
@@ -182,6 +250,10 @@
           </w:tcPr>
           <w:p>
             <w:r>
+              <w:rPr>
+                <w:rFonts w:ascii="Arial" w:hAnsi="Arial"/>
+                <w:sz w:val="18"/>
+              </w:rPr>
               <w:t>Para revisión</w:t>
             </w:r>
           </w:p>
@@ -193,7 +265,88 @@
           </w:tcPr>
           <w:p>
             <w:r>
+              <w:rPr>
+                <w:rFonts w:ascii="Arial" w:hAnsi="Arial"/>
+                <w:sz w:val="18"/>
+              </w:rPr>
               <w:t>Inicio e implementación técnica inicial de Fase 9: reportería, mapa de calor avanzado y exportaciones auditadas.</w:t>
+            </w:r>
+          </w:p>
+        </w:tc>
+      </w:tr>
+      <w:tr>
+        <w:tc>
+          <w:tcPr>
+            <w:tcW w:type="dxa" w:w="1872"/>
+            <w:vAlign w:val="center"/>
+          </w:tcPr>
+          <w:p>
+            <w:r>
+              <w:rPr>
+                <w:rFonts w:ascii="Arial" w:hAnsi="Arial"/>
+                <w:sz w:val="18"/>
+              </w:rPr>
+              <w:t>1.1</w:t>
+            </w:r>
+          </w:p>
+        </w:tc>
+        <w:tc>
+          <w:tcPr>
+            <w:tcW w:type="dxa" w:w="1872"/>
+            <w:vAlign w:val="center"/>
+          </w:tcPr>
+          <w:p>
+            <w:r>
+              <w:rPr>
+                <w:rFonts w:ascii="Arial" w:hAnsi="Arial"/>
+                <w:sz w:val="18"/>
+              </w:rPr>
+              <w:t>15/07/2026</w:t>
+            </w:r>
+          </w:p>
+        </w:tc>
+        <w:tc>
+          <w:tcPr>
+            <w:tcW w:type="dxa" w:w="1872"/>
+            <w:vAlign w:val="center"/>
+          </w:tcPr>
+          <w:p>
+            <w:r>
+              <w:rPr>
+                <w:rFonts w:ascii="Arial" w:hAnsi="Arial"/>
+                <w:sz w:val="18"/>
+              </w:rPr>
+              <w:t>Javier Mejía</w:t>
+            </w:r>
+          </w:p>
+        </w:tc>
+        <w:tc>
+          <w:tcPr>
+            <w:tcW w:type="dxa" w:w="1872"/>
+            <w:vAlign w:val="center"/>
+          </w:tcPr>
+          <w:p>
+            <w:r>
+              <w:rPr>
+                <w:rFonts w:ascii="Arial" w:hAnsi="Arial"/>
+                <w:sz w:val="18"/>
+              </w:rPr>
+              <w:t>Aprobada y cerrada</w:t>
+            </w:r>
+          </w:p>
+        </w:tc>
+        <w:tc>
+          <w:tcPr>
+            <w:tcW w:type="dxa" w:w="1872"/>
+            <w:vAlign w:val="center"/>
+          </w:tcPr>
+          <w:p>
+            <w:r>
+              <w:rPr>
+                <w:rFonts w:ascii="Arial" w:hAnsi="Arial"/>
+                <w:sz w:val="18"/>
+              </w:rPr>
+              <w:t>Validación funcional API/exportaciones/auditoría completada; cierre formal de Fase 9 y autorización para continuar según plan.</w:t>
             </w:r>
           </w:p>
         </w:tc>
@@ -205,6 +358,9 @@
         <w:pStyle w:val="Heading1"/>
       </w:pPr>
       <w:r>
+        <w:rPr>
+          <w:rFonts w:ascii="Arial" w:hAnsi="Arial"/>
+        </w:rPr>
         <w:t>2. Base documental revisada</w:t>
       </w:r>
     </w:p>
@@ -213,6 +369,9 @@
         <w:pStyle w:val="ListBullet"/>
       </w:pPr>
       <w:r>
+        <w:rPr>
+          <w:rFonts w:ascii="Arial" w:hAnsi="Arial"/>
+        </w:rPr>
         <w:t>Plan_Fases_Modulo_3_Matrices_Riesgos_SGRLA_IHSS.docx.</w:t>
       </w:r>
     </w:p>
@@ -221,6 +380,9 @@
         <w:pStyle w:val="ListBullet"/>
       </w:pPr>
       <w:r>
+        <w:rPr>
+          <w:rFonts w:ascii="Arial" w:hAnsi="Arial"/>
+        </w:rPr>
         <w:t>Analisis_Final_Maestro_Modulo_3_Matrices_Riesgos_SGRLA_IHSS.docx.</w:t>
       </w:r>
     </w:p>
@@ -229,6 +391,9 @@
         <w:pStyle w:val="ListBullet"/>
       </w:pPr>
       <w:r>
+        <w:rPr>
+          <w:rFonts w:ascii="Arial" w:hAnsi="Arial"/>
+        </w:rPr>
         <w:t>Fase 8 aprobada y cerrada por autorización formal de Javier Mejía.</w:t>
       </w:r>
     </w:p>
@@ -237,6 +402,9 @@
         <w:pStyle w:val="ListBullet"/>
       </w:pPr>
       <w:r>
+        <w:rPr>
+          <w:rFonts w:ascii="Arial" w:hAnsi="Arial"/>
+        </w:rPr>
         <w:t>Guía funcional de interfaces posterior al cierre de Fase 8.</w:t>
       </w:r>
     </w:p>
@@ -245,6 +413,9 @@
         <w:pStyle w:val="ListBullet"/>
       </w:pPr>
       <w:r>
+        <w:rPr>
+          <w:rFonts w:ascii="Arial" w:hAnsi="Arial"/>
+        </w:rPr>
         <w:t>Reglas institucionales vigentes: cálculo en backend, permisos por módulo, auditoría obligatoria, DNP como integración futura y no tocar CONTROL_ALMACEN.PROVEEDOR.</w:t>
       </w:r>
     </w:p>
@@ -253,11 +424,17 @@
         <w:pStyle w:val="Heading1"/>
       </w:pPr>
       <w:r>
+        <w:rPr>
+          <w:rFonts w:ascii="Arial" w:hAnsi="Arial"/>
+        </w:rPr>
         <w:t>3. Objetivo de la fase</w:t>
       </w:r>
     </w:p>
     <w:p>
       <w:r>
+        <w:rPr>
+          <w:rFonts w:ascii="Arial" w:hAnsi="Arial"/>
+        </w:rPr>
         <w:t>Entregar consultas ejecutivas y operativas para seguimiento del riesgo, resultados históricos y evidencia de gestión, usando únicamente datos persistidos en base de datos y manteniendo las exportaciones auditadas.</w:t>
       </w:r>
     </w:p>
@@ -266,7 +443,11 @@
         <w:pStyle w:val="Heading1"/>
       </w:pPr>
       <w:r>
-        <w:t>4. Alcance implementado en versión 1.0</w:t>
+        <w:rPr>
+          <w:rFonts w:ascii="Arial" w:hAnsi="Arial"/>
+          <w:sz w:val="20"/>
+        </w:rPr>
+        <w:t>4. Alcance implementado en versión 1.1</w:t>
       </w:r>
     </w:p>
     <w:tbl>
@@ -285,13 +466,22 @@
           <w:tcPr>
             <w:tcW w:type="dxa" w:w="2160"/>
             <w:vAlign w:val="center"/>
-            <w:shd w:fill="F2F4F7"/>
+            <w:shd w:fill="D9E2F3"/>
           </w:tcPr>
           <w:p>
-            <w:r/>
             <w:r>
               <w:rPr>
+                <w:rFonts w:ascii="Arial" w:hAnsi="Arial"/>
                 <w:b/>
+                <w:color w:val="0F172A"/>
+                <w:sz w:val="18"/>
+              </w:rPr>
+            </w:r>
+            <w:r>
+              <w:rPr>
+                <w:rFonts w:ascii="Arial" w:hAnsi="Arial"/>
+                <w:b/>
+                <w:color w:val="0F172A"/>
                 <w:sz w:val="18"/>
               </w:rPr>
               <w:t>Componente</w:t>
@@ -302,10 +492,16 @@
           <w:tcPr>
             <w:tcW w:type="dxa" w:w="7056"/>
             <w:vAlign w:val="center"/>
-            <w:shd w:fill="F2F4F7"/>
+            <w:shd w:fill="D9E2F3"/>
           </w:tcPr>
           <w:p>
             <w:r>
+              <w:rPr>
+                <w:rFonts w:ascii="Arial" w:hAnsi="Arial"/>
+                <w:b/>
+                <w:color w:val="0F172A"/>
+                <w:sz w:val="18"/>
+              </w:rPr>
               <w:t>Implementación</w:t>
             </w:r>
           </w:p>
@@ -318,9 +514,15 @@
             <w:vAlign w:val="center"/>
           </w:tcPr>
           <w:p>
-            <w:r/>
             <w:r>
               <w:rPr>
+                <w:rFonts w:ascii="Arial" w:hAnsi="Arial"/>
+                <w:sz w:val="18"/>
+              </w:rPr>
+            </w:r>
+            <w:r>
+              <w:rPr>
+                <w:rFonts w:ascii="Arial" w:hAnsi="Arial"/>
                 <w:b w:val="0"/>
                 <w:sz w:val="18"/>
               </w:rPr>
@@ -335,6 +537,10 @@
           </w:tcPr>
           <w:p>
             <w:r>
+              <w:rPr>
+                <w:rFonts w:ascii="Arial" w:hAnsi="Arial"/>
+                <w:sz w:val="18"/>
+              </w:rPr>
               <w:t>Endpoint de reporte consolidado y endpoint de exportación auditada en /api/matrices-riesgos/reportes.</w:t>
             </w:r>
           </w:p>
@@ -347,9 +553,15 @@
             <w:vAlign w:val="center"/>
           </w:tcPr>
           <w:p>
-            <w:r/>
             <w:r>
               <w:rPr>
+                <w:rFonts w:ascii="Arial" w:hAnsi="Arial"/>
+                <w:sz w:val="18"/>
+              </w:rPr>
+            </w:r>
+            <w:r>
+              <w:rPr>
+                <w:rFonts w:ascii="Arial" w:hAnsi="Arial"/>
                 <w:b w:val="0"/>
                 <w:sz w:val="18"/>
               </w:rPr>
@@ -363,9 +575,15 @@
             <w:vAlign w:val="center"/>
           </w:tcPr>
           <w:p>
-            <w:r/>
             <w:r>
               <w:rPr>
+                <w:rFonts w:ascii="Arial" w:hAnsi="Arial"/>
+                <w:sz w:val="18"/>
+              </w:rPr>
+            </w:r>
+            <w:r>
+              <w:rPr>
+                <w:rFonts w:ascii="Arial" w:hAnsi="Arial"/>
                 <w:b w:val="0"/>
                 <w:sz w:val="18"/>
               </w:rPr>
@@ -381,9 +599,15 @@
             <w:vAlign w:val="center"/>
           </w:tcPr>
           <w:p>
-            <w:r/>
             <w:r>
               <w:rPr>
+                <w:rFonts w:ascii="Arial" w:hAnsi="Arial"/>
+                <w:sz w:val="18"/>
+              </w:rPr>
+            </w:r>
+            <w:r>
+              <w:rPr>
+                <w:rFonts w:ascii="Arial" w:hAnsi="Arial"/>
                 <w:b w:val="0"/>
                 <w:sz w:val="18"/>
               </w:rPr>
@@ -398,6 +622,10 @@
           </w:tcPr>
           <w:p>
             <w:r>
+              <w:rPr>
+                <w:rFonts w:ascii="Arial" w:hAnsi="Arial"/>
+                <w:sz w:val="18"/>
+              </w:rPr>
               <w:t>Pestaña Reportes con filtros, tarjetas ejecutivas, mapa inherente/residual persistido, tabla por factor y matrices críticas.</w:t>
             </w:r>
           </w:p>
@@ -411,6 +639,10 @@
           </w:tcPr>
           <w:p>
             <w:r>
+              <w:rPr>
+                <w:rFonts w:ascii="Arial" w:hAnsi="Arial"/>
+                <w:sz w:val="18"/>
+              </w:rPr>
               <w:t>Exportación Excel</w:t>
             </w:r>
           </w:p>
@@ -421,9 +653,15 @@
             <w:vAlign w:val="center"/>
           </w:tcPr>
           <w:p>
-            <w:r/>
             <w:r>
               <w:rPr>
+                <w:rFonts w:ascii="Arial" w:hAnsi="Arial"/>
+                <w:sz w:val="18"/>
+              </w:rPr>
+            </w:r>
+            <w:r>
+              <w:rPr>
+                <w:rFonts w:ascii="Arial" w:hAnsi="Arial"/>
                 <w:b w:val="0"/>
                 <w:sz w:val="18"/>
               </w:rPr>
@@ -440,6 +678,10 @@
           </w:tcPr>
           <w:p>
             <w:r>
+              <w:rPr>
+                <w:rFonts w:ascii="Arial" w:hAnsi="Arial"/>
+                <w:sz w:val="18"/>
+              </w:rPr>
               <w:t>Generación PDF</w:t>
             </w:r>
           </w:p>
@@ -451,6 +693,10 @@
           </w:tcPr>
           <w:p>
             <w:r>
+              <w:rPr>
+                <w:rFonts w:ascii="Arial" w:hAnsi="Arial"/>
+                <w:sz w:val="18"/>
+              </w:rPr>
               <w:t>Salida PDF básica generada desde backend para revisión ejecutiva inicial.</w:t>
             </w:r>
           </w:p>
@@ -464,6 +710,10 @@
           </w:tcPr>
           <w:p>
             <w:r>
+              <w:rPr>
+                <w:rFonts w:ascii="Arial" w:hAnsi="Arial"/>
+                <w:sz w:val="18"/>
+              </w:rPr>
               <w:t>Auditoría</w:t>
             </w:r>
           </w:p>
@@ -475,6 +725,10 @@
           </w:tcPr>
           <w:p>
             <w:r>
+              <w:rPr>
+                <w:rFonts w:ascii="Arial" w:hAnsi="Arial"/>
+                <w:sz w:val="18"/>
+              </w:rPr>
               <w:t>Cada exportación registra trazabilidad funcional en RL_MR_HISTORIAL y auditoría en RL_AUDITORIA con acción válida VER.</w:t>
             </w:r>
           </w:p>
@@ -487,6 +741,9 @@
         <w:pStyle w:val="Heading1"/>
       </w:pPr>
       <w:r>
+        <w:rPr>
+          <w:rFonts w:ascii="Arial" w:hAnsi="Arial"/>
+        </w:rPr>
         <w:t>5. Endpoints backend agregados</w:t>
       </w:r>
     </w:p>
@@ -508,10 +765,16 @@
           <w:tcPr>
             <w:tcW w:type="dxa" w:w="1008"/>
             <w:vAlign w:val="center"/>
-            <w:shd w:fill="F2F4F7"/>
+            <w:shd w:fill="D9E2F3"/>
           </w:tcPr>
           <w:p>
             <w:r>
+              <w:rPr>
+                <w:rFonts w:ascii="Arial" w:hAnsi="Arial"/>
+                <w:b/>
+                <w:color w:val="0F172A"/>
+                <w:sz w:val="18"/>
+              </w:rPr>
               <w:t>Método</w:t>
             </w:r>
           </w:p>
@@ -520,13 +783,22 @@
           <w:tcPr>
             <w:tcW w:type="dxa" w:w="3024"/>
             <w:vAlign w:val="center"/>
-            <w:shd w:fill="F2F4F7"/>
+            <w:shd w:fill="D9E2F3"/>
           </w:tcPr>
           <w:p>
-            <w:r/>
             <w:r>
               <w:rPr>
+                <w:rFonts w:ascii="Arial" w:hAnsi="Arial"/>
                 <w:b/>
+                <w:color w:val="0F172A"/>
+                <w:sz w:val="18"/>
+              </w:rPr>
+            </w:r>
+            <w:r>
+              <w:rPr>
+                <w:rFonts w:ascii="Arial" w:hAnsi="Arial"/>
+                <w:b/>
+                <w:color w:val="0F172A"/>
                 <w:sz w:val="18"/>
               </w:rPr>
               <w:t>Ruta</w:t>
@@ -537,10 +809,16 @@
           <w:tcPr>
             <w:tcW w:type="dxa" w:w="3456"/>
             <w:vAlign w:val="center"/>
-            <w:shd w:fill="F2F4F7"/>
+            <w:shd w:fill="D9E2F3"/>
           </w:tcPr>
           <w:p>
             <w:r>
+              <w:rPr>
+                <w:rFonts w:ascii="Arial" w:hAnsi="Arial"/>
+                <w:b/>
+                <w:color w:val="0F172A"/>
+                <w:sz w:val="18"/>
+              </w:rPr>
               <w:t>Propósito</w:t>
             </w:r>
           </w:p>
@@ -549,10 +827,16 @@
           <w:tcPr>
             <w:tcW w:type="dxa" w:w="1728"/>
             <w:vAlign w:val="center"/>
-            <w:shd w:fill="F2F4F7"/>
+            <w:shd w:fill="D9E2F3"/>
           </w:tcPr>
           <w:p>
             <w:r>
+              <w:rPr>
+                <w:rFonts w:ascii="Arial" w:hAnsi="Arial"/>
+                <w:b/>
+                <w:color w:val="0F172A"/>
+                <w:sz w:val="18"/>
+              </w:rPr>
               <w:t>Auditoría</w:t>
             </w:r>
           </w:p>
@@ -565,9 +849,15 @@
             <w:vAlign w:val="center"/>
           </w:tcPr>
           <w:p>
-            <w:r/>
             <w:r>
               <w:rPr>
+                <w:rFonts w:ascii="Arial" w:hAnsi="Arial"/>
+                <w:sz w:val="18"/>
+              </w:rPr>
+            </w:r>
+            <w:r>
+              <w:rPr>
+                <w:rFonts w:ascii="Arial" w:hAnsi="Arial"/>
                 <w:b w:val="0"/>
                 <w:sz w:val="18"/>
               </w:rPr>
@@ -581,9 +871,15 @@
             <w:vAlign w:val="center"/>
           </w:tcPr>
           <w:p>
-            <w:r/>
             <w:r>
               <w:rPr>
+                <w:rFonts w:ascii="Arial" w:hAnsi="Arial"/>
+                <w:sz w:val="18"/>
+              </w:rPr>
+            </w:r>
+            <w:r>
+              <w:rPr>
+                <w:rFonts w:ascii="Arial" w:hAnsi="Arial"/>
                 <w:b w:val="0"/>
                 <w:sz w:val="18"/>
               </w:rPr>
@@ -598,6 +894,10 @@
           </w:tcPr>
           <w:p>
             <w:r>
+              <w:rPr>
+                <w:rFonts w:ascii="Arial" w:hAnsi="Arial"/>
+                <w:sz w:val="18"/>
+              </w:rPr>
               <w:t>Consulta reportería consolidada con filtros por búsqueda, estado, sujeto, nivel residual, versión, responsable y fechas.</w:t>
             </w:r>
           </w:p>
@@ -609,6 +909,10 @@
           </w:tcPr>
           <w:p>
             <w:r>
+              <w:rPr>
+                <w:rFonts w:ascii="Arial" w:hAnsi="Arial"/>
+                <w:sz w:val="18"/>
+              </w:rPr>
               <w:t>No registra auditoría por ser consulta operativa.</w:t>
             </w:r>
           </w:p>
@@ -621,9 +925,15 @@
             <w:vAlign w:val="center"/>
           </w:tcPr>
           <w:p>
-            <w:r/>
             <w:r>
               <w:rPr>
+                <w:rFonts w:ascii="Arial" w:hAnsi="Arial"/>
+                <w:sz w:val="18"/>
+              </w:rPr>
+            </w:r>
+            <w:r>
+              <w:rPr>
+                <w:rFonts w:ascii="Arial" w:hAnsi="Arial"/>
                 <w:b w:val="0"/>
                 <w:sz w:val="18"/>
               </w:rPr>
@@ -638,6 +948,10 @@
           </w:tcPr>
           <w:p>
             <w:r>
+              <w:rPr>
+                <w:rFonts w:ascii="Arial" w:hAnsi="Arial"/>
+                <w:sz w:val="18"/>
+              </w:rPr>
               <w:t>/api/matrices-riesgos/reportes/exportar?formato=EXCEL</w:t>
             </w:r>
           </w:p>
@@ -648,9 +962,15 @@
             <w:vAlign w:val="center"/>
           </w:tcPr>
           <w:p>
-            <w:r/>
             <w:r>
               <w:rPr>
+                <w:rFonts w:ascii="Arial" w:hAnsi="Arial"/>
+                <w:sz w:val="18"/>
+              </w:rPr>
+            </w:r>
+            <w:r>
+              <w:rPr>
+                <w:rFonts w:ascii="Arial" w:hAnsi="Arial"/>
                 <w:b w:val="0"/>
                 <w:sz w:val="18"/>
               </w:rPr>
@@ -664,9 +984,15 @@
             <w:vAlign w:val="center"/>
           </w:tcPr>
           <w:p>
-            <w:r/>
             <w:r>
               <w:rPr>
+                <w:rFonts w:ascii="Arial" w:hAnsi="Arial"/>
+                <w:sz w:val="18"/>
+              </w:rPr>
+            </w:r>
+            <w:r>
+              <w:rPr>
+                <w:rFonts w:ascii="Arial" w:hAnsi="Arial"/>
                 <w:b w:val="0"/>
                 <w:sz w:val="18"/>
               </w:rPr>
@@ -682,9 +1008,15 @@
             <w:vAlign w:val="center"/>
           </w:tcPr>
           <w:p>
-            <w:r/>
             <w:r>
               <w:rPr>
+                <w:rFonts w:ascii="Arial" w:hAnsi="Arial"/>
+                <w:sz w:val="18"/>
+              </w:rPr>
+            </w:r>
+            <w:r>
+              <w:rPr>
+                <w:rFonts w:ascii="Arial" w:hAnsi="Arial"/>
                 <w:b w:val="0"/>
                 <w:sz w:val="18"/>
               </w:rPr>
@@ -699,6 +1031,10 @@
           </w:tcPr>
           <w:p>
             <w:r>
+              <w:rPr>
+                <w:rFonts w:ascii="Arial" w:hAnsi="Arial"/>
+                <w:sz w:val="18"/>
+              </w:rPr>
               <w:t>/api/matrices-riesgos/reportes/exportar?formato=PDF</w:t>
             </w:r>
           </w:p>
@@ -710,6 +1046,10 @@
           </w:tcPr>
           <w:p>
             <w:r>
+              <w:rPr>
+                <w:rFonts w:ascii="Arial" w:hAnsi="Arial"/>
+                <w:sz w:val="18"/>
+              </w:rPr>
               <w:t>Genera PDF básico ejecutivo con resumen y matrices críticas.</w:t>
             </w:r>
           </w:p>
@@ -720,9 +1060,15 @@
             <w:vAlign w:val="center"/>
           </w:tcPr>
           <w:p>
-            <w:r/>
             <w:r>
               <w:rPr>
+                <w:rFonts w:ascii="Arial" w:hAnsi="Arial"/>
+                <w:sz w:val="18"/>
+              </w:rPr>
+            </w:r>
+            <w:r>
+              <w:rPr>
+                <w:rFonts w:ascii="Arial" w:hAnsi="Arial"/>
                 <w:b w:val="0"/>
                 <w:sz w:val="18"/>
               </w:rPr>
@@ -738,6 +1084,9 @@
         <w:pStyle w:val="Heading1"/>
       </w:pPr>
       <w:r>
+        <w:rPr>
+          <w:rFonts w:ascii="Arial" w:hAnsi="Arial"/>
+        </w:rPr>
         <w:t>6. Datos incluidos en reportería</w:t>
       </w:r>
     </w:p>
@@ -746,6 +1095,9 @@
         <w:pStyle w:val="ListBullet"/>
       </w:pPr>
       <w:r>
+        <w:rPr>
+          <w:rFonts w:ascii="Arial" w:hAnsi="Arial"/>
+        </w:rPr>
         <w:t>Totales: matrices, calculadas, cerradas, alto/crítico, plan requerido y planes vencidos.</w:t>
       </w:r>
     </w:p>
@@ -754,6 +1106,9 @@
         <w:pStyle w:val="ListBullet"/>
       </w:pPr>
       <w:r>
+        <w:rPr>
+          <w:rFonts w:ascii="Arial" w:hAnsi="Arial"/>
+        </w:rPr>
         <w:t>Distribución por estado, nivel residual y tipo de sujeto.</w:t>
       </w:r>
     </w:p>
@@ -762,6 +1117,9 @@
         <w:pStyle w:val="ListBullet"/>
       </w:pPr>
       <w:r>
+        <w:rPr>
+          <w:rFonts w:ascii="Arial" w:hAnsi="Arial"/>
+        </w:rPr>
         <w:t>Resultados por factor con promedio inherente, promedio residual, total alto/crítico y planes requeridos.</w:t>
       </w:r>
     </w:p>
@@ -770,6 +1128,9 @@
         <w:pStyle w:val="ListBullet"/>
       </w:pPr>
       <w:r>
+        <w:rPr>
+          <w:rFonts w:ascii="Arial" w:hAnsi="Arial"/>
+        </w:rPr>
         <w:t>Mapa inherente y mapa residual basados en resultados institucionales vigentes persistidos.</w:t>
       </w:r>
     </w:p>
@@ -778,6 +1139,9 @@
         <w:pStyle w:val="ListBullet"/>
       </w:pPr>
       <w:r>
+        <w:rPr>
+          <w:rFonts w:ascii="Arial" w:hAnsi="Arial"/>
+        </w:rPr>
         <w:t>Matrices críticas limitadas a niveles Alto y Crítico.</w:t>
       </w:r>
     </w:p>
@@ -786,6 +1150,9 @@
         <w:pStyle w:val="ListBullet"/>
       </w:pPr>
       <w:r>
+        <w:rPr>
+          <w:rFonts w:ascii="Arial" w:hAnsi="Arial"/>
+        </w:rPr>
         <w:t>Resumen de planes de acción por estado y vencimiento.</w:t>
       </w:r>
     </w:p>
@@ -794,6 +1161,9 @@
         <w:pStyle w:val="Heading1"/>
       </w:pPr>
       <w:r>
+        <w:rPr>
+          <w:rFonts w:ascii="Arial" w:hAnsi="Arial"/>
+        </w:rPr>
         <w:t>7. Reglas técnicas respetadas</w:t>
       </w:r>
     </w:p>
@@ -802,6 +1172,9 @@
         <w:pStyle w:val="ListBullet"/>
       </w:pPr>
       <w:r>
+        <w:rPr>
+          <w:rFonts w:ascii="Arial" w:hAnsi="Arial"/>
+        </w:rPr>
         <w:t>Angular no calcula riesgo; solo presenta datos devueltos por backend.</w:t>
       </w:r>
     </w:p>
@@ -810,6 +1183,9 @@
         <w:pStyle w:val="ListBullet"/>
       </w:pPr>
       <w:r>
+        <w:rPr>
+          <w:rFonts w:ascii="Arial" w:hAnsi="Arial"/>
+        </w:rPr>
         <w:t>Los reportes usan RL_MR_RESULTADOS vigentes, no cálculos improvisados en pantalla.</w:t>
       </w:r>
     </w:p>
@@ -818,6 +1194,9 @@
         <w:pStyle w:val="ListBullet"/>
       </w:pPr>
       <w:r>
+        <w:rPr>
+          <w:rFonts w:ascii="Arial" w:hAnsi="Arial"/>
+        </w:rPr>
         <w:t>Las exportaciones son generadas por backend para conservar trazabilidad centralizada.</w:t>
       </w:r>
     </w:p>
@@ -826,6 +1205,9 @@
         <w:pStyle w:val="ListBullet"/>
       </w:pPr>
       <w:r>
+        <w:rPr>
+          <w:rFonts w:ascii="Arial" w:hAnsi="Arial"/>
+        </w:rPr>
         <w:t>Se conserva JWT + ModuloAuthorize(10); no se crean permisos por acción.</w:t>
       </w:r>
     </w:p>
@@ -834,6 +1216,9 @@
         <w:pStyle w:val="ListBullet"/>
       </w:pPr>
       <w:r>
+        <w:rPr>
+          <w:rFonts w:ascii="Arial" w:hAnsi="Arial"/>
+        </w:rPr>
         <w:t>No se habilita escritura hacia DNP.</w:t>
       </w:r>
     </w:p>
@@ -842,6 +1227,9 @@
         <w:pStyle w:val="ListBullet"/>
       </w:pPr>
       <w:r>
+        <w:rPr>
+          <w:rFonts w:ascii="Arial" w:hAnsi="Arial"/>
+        </w:rPr>
         <w:t>No se toca CONTROL_ALMACEN.PROVEEDOR.</w:t>
       </w:r>
     </w:p>
@@ -850,6 +1238,9 @@
         <w:pStyle w:val="ListBullet"/>
       </w:pPr>
       <w:r>
+        <w:rPr>
+          <w:rFonts w:ascii="Arial" w:hAnsi="Arial"/>
+        </w:rPr>
         <w:t>No se crean tablas nuevas ni se modifica la estructura Oracle aprobada.</w:t>
       </w:r>
     </w:p>
@@ -858,6 +1249,9 @@
         <w:pStyle w:val="Heading1"/>
       </w:pPr>
       <w:r>
+        <w:rPr>
+          <w:rFonts w:ascii="Arial" w:hAnsi="Arial"/>
+        </w:rPr>
         <w:t>8. Archivos principales modificados</w:t>
       </w:r>
     </w:p>
@@ -878,13 +1272,22 @@
           <w:tcPr>
             <w:tcW w:type="dxa" w:w="1440"/>
             <w:vAlign w:val="center"/>
-            <w:shd w:fill="F2F4F7"/>
+            <w:shd w:fill="D9E2F3"/>
           </w:tcPr>
           <w:p>
-            <w:r/>
             <w:r>
               <w:rPr>
+                <w:rFonts w:ascii="Arial" w:hAnsi="Arial"/>
                 <w:b/>
+                <w:color w:val="0F172A"/>
+                <w:sz w:val="18"/>
+              </w:rPr>
+            </w:r>
+            <w:r>
+              <w:rPr>
+                <w:rFonts w:ascii="Arial" w:hAnsi="Arial"/>
+                <w:b/>
+                <w:color w:val="0F172A"/>
                 <w:sz w:val="18"/>
               </w:rPr>
               <w:t>Ambiente</w:t>
@@ -895,13 +1298,22 @@
           <w:tcPr>
             <w:tcW w:type="dxa" w:w="3024"/>
             <w:vAlign w:val="center"/>
-            <w:shd w:fill="F2F4F7"/>
+            <w:shd w:fill="D9E2F3"/>
           </w:tcPr>
           <w:p>
-            <w:r/>
             <w:r>
               <w:rPr>
+                <w:rFonts w:ascii="Arial" w:hAnsi="Arial"/>
                 <w:b/>
+                <w:color w:val="0F172A"/>
+                <w:sz w:val="18"/>
+              </w:rPr>
+            </w:r>
+            <w:r>
+              <w:rPr>
+                <w:rFonts w:ascii="Arial" w:hAnsi="Arial"/>
+                <w:b/>
+                <w:color w:val="0F172A"/>
                 <w:sz w:val="18"/>
               </w:rPr>
               <w:t>Archivo</w:t>
@@ -912,13 +1324,22 @@
           <w:tcPr>
             <w:tcW w:type="dxa" w:w="4608"/>
             <w:vAlign w:val="center"/>
-            <w:shd w:fill="F2F4F7"/>
+            <w:shd w:fill="D9E2F3"/>
           </w:tcPr>
           <w:p>
-            <w:r/>
             <w:r>
               <w:rPr>
+                <w:rFonts w:ascii="Arial" w:hAnsi="Arial"/>
                 <w:b/>
+                <w:color w:val="0F172A"/>
+                <w:sz w:val="18"/>
+              </w:rPr>
+            </w:r>
+            <w:r>
+              <w:rPr>
+                <w:rFonts w:ascii="Arial" w:hAnsi="Arial"/>
+                <w:b/>
+                <w:color w:val="0F172A"/>
                 <w:sz w:val="18"/>
               </w:rPr>
               <w:t>Cambio</w:t>
@@ -933,9 +1354,15 @@
             <w:vAlign w:val="center"/>
           </w:tcPr>
           <w:p>
-            <w:r/>
             <w:r>
               <w:rPr>
+                <w:rFonts w:ascii="Arial" w:hAnsi="Arial"/>
+                <w:sz w:val="18"/>
+              </w:rPr>
+            </w:r>
+            <w:r>
+              <w:rPr>
+                <w:rFonts w:ascii="Arial" w:hAnsi="Arial"/>
                 <w:b w:val="0"/>
                 <w:sz w:val="18"/>
               </w:rPr>
@@ -949,9 +1376,15 @@
             <w:vAlign w:val="center"/>
           </w:tcPr>
           <w:p>
-            <w:r/>
             <w:r>
               <w:rPr>
+                <w:rFonts w:ascii="Arial" w:hAnsi="Arial"/>
+                <w:sz w:val="18"/>
+              </w:rPr>
+            </w:r>
+            <w:r>
+              <w:rPr>
+                <w:rFonts w:ascii="Arial" w:hAnsi="Arial"/>
                 <w:b w:val="0"/>
                 <w:sz w:val="18"/>
               </w:rPr>
@@ -966,6 +1399,10 @@
           </w:tcPr>
           <w:p>
             <w:r>
+              <w:rPr>
+                <w:rFonts w:ascii="Arial" w:hAnsi="Arial"/>
+                <w:sz w:val="18"/>
+              </w:rPr>
               <w:t>Endpoints de reporte y exportación.</w:t>
             </w:r>
           </w:p>
@@ -978,9 +1415,15 @@
             <w:vAlign w:val="center"/>
           </w:tcPr>
           <w:p>
-            <w:r/>
             <w:r>
               <w:rPr>
+                <w:rFonts w:ascii="Arial" w:hAnsi="Arial"/>
+                <w:sz w:val="18"/>
+              </w:rPr>
+            </w:r>
+            <w:r>
+              <w:rPr>
+                <w:rFonts w:ascii="Arial" w:hAnsi="Arial"/>
                 <w:b w:val="0"/>
                 <w:sz w:val="18"/>
               </w:rPr>
@@ -994,9 +1437,15 @@
             <w:vAlign w:val="center"/>
           </w:tcPr>
           <w:p>
-            <w:r/>
             <w:r>
               <w:rPr>
+                <w:rFonts w:ascii="Arial" w:hAnsi="Arial"/>
+                <w:sz w:val="18"/>
+              </w:rPr>
+            </w:r>
+            <w:r>
+              <w:rPr>
+                <w:rFonts w:ascii="Arial" w:hAnsi="Arial"/>
                 <w:b w:val="0"/>
                 <w:sz w:val="18"/>
               </w:rPr>
@@ -1011,6 +1460,10 @@
           </w:tcPr>
           <w:p>
             <w:r>
+              <w:rPr>
+                <w:rFonts w:ascii="Arial" w:hAnsi="Arial"/>
+                <w:sz w:val="18"/>
+              </w:rPr>
               <w:t>DTOs de filtros, reporte, mapas, factores, planes y exportación.</w:t>
             </w:r>
           </w:p>
@@ -1023,9 +1476,15 @@
             <w:vAlign w:val="center"/>
           </w:tcPr>
           <w:p>
-            <w:r/>
             <w:r>
               <w:rPr>
+                <w:rFonts w:ascii="Arial" w:hAnsi="Arial"/>
+                <w:sz w:val="18"/>
+              </w:rPr>
+            </w:r>
+            <w:r>
+              <w:rPr>
+                <w:rFonts w:ascii="Arial" w:hAnsi="Arial"/>
                 <w:b w:val="0"/>
                 <w:sz w:val="18"/>
               </w:rPr>
@@ -1039,9 +1498,15 @@
             <w:vAlign w:val="center"/>
           </w:tcPr>
           <w:p>
-            <w:r/>
             <w:r>
               <w:rPr>
+                <w:rFonts w:ascii="Arial" w:hAnsi="Arial"/>
+                <w:sz w:val="18"/>
+              </w:rPr>
+            </w:r>
+            <w:r>
+              <w:rPr>
+                <w:rFonts w:ascii="Arial" w:hAnsi="Arial"/>
                 <w:b w:val="0"/>
                 <w:sz w:val="18"/>
               </w:rPr>
@@ -1056,6 +1521,10 @@
           </w:tcPr>
           <w:p>
             <w:r>
+              <w:rPr>
+                <w:rFonts w:ascii="Arial" w:hAnsi="Arial"/>
+                <w:sz w:val="18"/>
+              </w:rPr>
               <w:t>Servicio de reporte, generación Excel/PDF y validación de formato.</w:t>
             </w:r>
           </w:p>
@@ -1068,9 +1537,15 @@
             <w:vAlign w:val="center"/>
           </w:tcPr>
           <w:p>
-            <w:r/>
             <w:r>
               <w:rPr>
+                <w:rFonts w:ascii="Arial" w:hAnsi="Arial"/>
+                <w:sz w:val="18"/>
+              </w:rPr>
+            </w:r>
+            <w:r>
+              <w:rPr>
+                <w:rFonts w:ascii="Arial" w:hAnsi="Arial"/>
                 <w:b w:val="0"/>
                 <w:sz w:val="18"/>
               </w:rPr>
@@ -1084,9 +1559,15 @@
             <w:vAlign w:val="center"/>
           </w:tcPr>
           <w:p>
-            <w:r/>
             <w:r>
               <w:rPr>
+                <w:rFonts w:ascii="Arial" w:hAnsi="Arial"/>
+                <w:sz w:val="18"/>
+              </w:rPr>
+            </w:r>
+            <w:r>
+              <w:rPr>
+                <w:rFonts w:ascii="Arial" w:hAnsi="Arial"/>
                 <w:b w:val="0"/>
                 <w:sz w:val="18"/>
               </w:rPr>
@@ -1101,6 +1582,10 @@
           </w:tcPr>
           <w:p>
             <w:r>
+              <w:rPr>
+                <w:rFonts w:ascii="Arial" w:hAnsi="Arial"/>
+                <w:sz w:val="18"/>
+              </w:rPr>
               <w:t>Consultas Oracle, auditoría e historial de exportaciones.</w:t>
             </w:r>
           </w:p>
@@ -1113,9 +1598,15 @@
             <w:vAlign w:val="center"/>
           </w:tcPr>
           <w:p>
-            <w:r/>
             <w:r>
               <w:rPr>
+                <w:rFonts w:ascii="Arial" w:hAnsi="Arial"/>
+                <w:sz w:val="18"/>
+              </w:rPr>
+            </w:r>
+            <w:r>
+              <w:rPr>
+                <w:rFonts w:ascii="Arial" w:hAnsi="Arial"/>
                 <w:b w:val="0"/>
                 <w:sz w:val="18"/>
               </w:rPr>
@@ -1129,9 +1620,15 @@
             <w:vAlign w:val="center"/>
           </w:tcPr>
           <w:p>
-            <w:r/>
             <w:r>
               <w:rPr>
+                <w:rFonts w:ascii="Arial" w:hAnsi="Arial"/>
+                <w:sz w:val="18"/>
+              </w:rPr>
+            </w:r>
+            <w:r>
+              <w:rPr>
+                <w:rFonts w:ascii="Arial" w:hAnsi="Arial"/>
                 <w:b w:val="0"/>
                 <w:sz w:val="18"/>
               </w:rPr>
@@ -1146,6 +1643,10 @@
           </w:tcPr>
           <w:p>
             <w:r>
+              <w:rPr>
+                <w:rFonts w:ascii="Arial" w:hAnsi="Arial"/>
+                <w:sz w:val="18"/>
+              </w:rPr>
               <w:t>Métodos reporte y exportarReporte.</w:t>
             </w:r>
           </w:p>
@@ -1158,9 +1659,15 @@
             <w:vAlign w:val="center"/>
           </w:tcPr>
           <w:p>
-            <w:r/>
             <w:r>
               <w:rPr>
+                <w:rFonts w:ascii="Arial" w:hAnsi="Arial"/>
+                <w:sz w:val="18"/>
+              </w:rPr>
+            </w:r>
+            <w:r>
+              <w:rPr>
+                <w:rFonts w:ascii="Arial" w:hAnsi="Arial"/>
                 <w:b w:val="0"/>
                 <w:sz w:val="18"/>
               </w:rPr>
@@ -1174,9 +1681,15 @@
             <w:vAlign w:val="center"/>
           </w:tcPr>
           <w:p>
-            <w:r/>
             <w:r>
               <w:rPr>
+                <w:rFonts w:ascii="Arial" w:hAnsi="Arial"/>
+                <w:sz w:val="18"/>
+              </w:rPr>
+            </w:r>
+            <w:r>
+              <w:rPr>
+                <w:rFonts w:ascii="Arial" w:hAnsi="Arial"/>
                 <w:b w:val="0"/>
                 <w:sz w:val="18"/>
               </w:rPr>
@@ -1191,6 +1704,10 @@
           </w:tcPr>
           <w:p>
             <w:r>
+              <w:rPr>
+                <w:rFonts w:ascii="Arial" w:hAnsi="Arial"/>
+                <w:sz w:val="18"/>
+              </w:rPr>
               <w:t>Pestaña Reportes, filtros, mapa y exportaciones.</w:t>
             </w:r>
           </w:p>
@@ -1203,6 +1720,9 @@
         <w:pStyle w:val="Heading1"/>
       </w:pPr>
       <w:r>
+        <w:rPr>
+          <w:rFonts w:ascii="Arial" w:hAnsi="Arial"/>
+        </w:rPr>
         <w:t>9. Validación técnica ejecutada</w:t>
       </w:r>
     </w:p>
@@ -1222,10 +1742,16 @@
           <w:tcPr>
             <w:tcW w:type="dxa" w:w="2880"/>
             <w:vAlign w:val="center"/>
-            <w:shd w:fill="F2F4F7"/>
+            <w:shd w:fill="D9E2F3"/>
           </w:tcPr>
           <w:p>
             <w:r>
+              <w:rPr>
+                <w:rFonts w:ascii="Arial" w:hAnsi="Arial"/>
+                <w:b/>
+                <w:color w:val="0F172A"/>
+                <w:sz w:val="18"/>
+              </w:rPr>
               <w:t>Validación</w:t>
             </w:r>
           </w:p>
@@ -1234,13 +1760,22 @@
           <w:tcPr>
             <w:tcW w:type="dxa" w:w="6336"/>
             <w:vAlign w:val="center"/>
-            <w:shd w:fill="F2F4F7"/>
+            <w:shd w:fill="D9E2F3"/>
           </w:tcPr>
           <w:p>
-            <w:r/>
             <w:r>
               <w:rPr>
+                <w:rFonts w:ascii="Arial" w:hAnsi="Arial"/>
                 <w:b/>
+                <w:color w:val="0F172A"/>
+                <w:sz w:val="18"/>
+              </w:rPr>
+            </w:r>
+            <w:r>
+              <w:rPr>
+                <w:rFonts w:ascii="Arial" w:hAnsi="Arial"/>
+                <w:b/>
+                <w:color w:val="0F172A"/>
                 <w:sz w:val="18"/>
               </w:rPr>
               <w:t>Resultado</w:t>
@@ -1255,9 +1790,15 @@
             <w:vAlign w:val="center"/>
           </w:tcPr>
           <w:p>
-            <w:r/>
             <w:r>
               <w:rPr>
+                <w:rFonts w:ascii="Arial" w:hAnsi="Arial"/>
+                <w:sz w:val="18"/>
+              </w:rPr>
+            </w:r>
+            <w:r>
+              <w:rPr>
+                <w:rFonts w:ascii="Arial" w:hAnsi="Arial"/>
                 <w:b w:val="0"/>
                 <w:sz w:val="18"/>
               </w:rPr>
@@ -1272,6 +1813,10 @@
           </w:tcPr>
           <w:p>
             <w:r>
+              <w:rPr>
+                <w:rFonts w:ascii="Arial" w:hAnsi="Arial"/>
+                <w:sz w:val="18"/>
+              </w:rPr>
               <w:t>Correcto con salida temporal: 0 errores y 0 advertencias. El build estándar estaba bloqueado por proceso dotnet activo.</w:t>
             </w:r>
           </w:p>
@@ -1284,9 +1829,15 @@
             <w:vAlign w:val="center"/>
           </w:tcPr>
           <w:p>
-            <w:r/>
             <w:r>
               <w:rPr>
+                <w:rFonts w:ascii="Arial" w:hAnsi="Arial"/>
+                <w:sz w:val="18"/>
+              </w:rPr>
+            </w:r>
+            <w:r>
+              <w:rPr>
+                <w:rFonts w:ascii="Arial" w:hAnsi="Arial"/>
                 <w:b w:val="0"/>
                 <w:sz w:val="18"/>
               </w:rPr>
@@ -1300,9 +1851,15 @@
             <w:vAlign w:val="center"/>
           </w:tcPr>
           <w:p>
-            <w:r/>
             <w:r>
               <w:rPr>
+                <w:rFonts w:ascii="Arial" w:hAnsi="Arial"/>
+                <w:sz w:val="18"/>
+              </w:rPr>
+            </w:r>
+            <w:r>
+              <w:rPr>
+                <w:rFonts w:ascii="Arial" w:hAnsi="Arial"/>
                 <w:b w:val="0"/>
                 <w:sz w:val="18"/>
               </w:rPr>
@@ -1318,9 +1875,15 @@
             <w:vAlign w:val="center"/>
           </w:tcPr>
           <w:p>
-            <w:r/>
             <w:r>
               <w:rPr>
+                <w:rFonts w:ascii="Arial" w:hAnsi="Arial"/>
+                <w:sz w:val="18"/>
+              </w:rPr>
+            </w:r>
+            <w:r>
+              <w:rPr>
+                <w:rFonts w:ascii="Arial" w:hAnsi="Arial"/>
                 <w:b w:val="0"/>
                 <w:sz w:val="18"/>
               </w:rPr>
@@ -1335,7 +1898,18 @@
           </w:tcPr>
           <w:p>
             <w:r>
-              <w:t>Sin cambios estructurales. La validación funcional con datos reales queda pendiente.</w:t>
+              <w:rPr>
+                <w:rFonts w:ascii="Arial" w:hAnsi="Arial"/>
+                <w:sz w:val="18"/>
+              </w:rPr>
+            </w:r>
+            <w:r>
+              <w:rPr>
+                <w:rFonts w:ascii="Arial" w:hAnsi="Arial"/>
+                <w:b w:val="0"/>
+                <w:sz w:val="18"/>
+              </w:rPr>
+              <w:t>Sin cambios estructurales. Los reportes consumen resultados persistidos vigentes desde Oracle mediante backend.</w:t>
             </w:r>
           </w:p>
         </w:tc>
@@ -1348,6 +1922,10 @@
           </w:tcPr>
           <w:p>
             <w:r>
+              <w:rPr>
+                <w:rFonts w:ascii="Arial" w:hAnsi="Arial"/>
+                <w:sz w:val="18"/>
+              </w:rPr>
               <w:t>Auditoría</w:t>
             </w:r>
           </w:p>
@@ -1359,7 +1937,153 @@
           </w:tcPr>
           <w:p>
             <w:r>
-              <w:t>Implementada a nivel de código; requiere prueba navegada/API para confirmar registros en Oracle.</w:t>
+              <w:rPr>
+                <w:rFonts w:ascii="Arial" w:hAnsi="Arial"/>
+                <w:sz w:val="18"/>
+              </w:rPr>
+              <w:t>Validada por API de Bitácora: exportaciones registradas en RL_AUDITORIA con acción VER, tabla RL_MR_RESULTADOS y módulo MatricesRiesgos.</w:t>
+            </w:r>
+          </w:p>
+        </w:tc>
+      </w:tr>
+      <w:tr>
+        <w:tc>
+          <w:tcPr>
+            <w:tcW w:type="dxa" w:w="4680"/>
+            <w:vAlign w:val="center"/>
+          </w:tcPr>
+          <w:p>
+            <w:r>
+              <w:rPr>
+                <w:rFonts w:ascii="Arial" w:hAnsi="Arial"/>
+                <w:sz w:val="18"/>
+              </w:rPr>
+            </w:r>
+            <w:r>
+              <w:rPr>
+                <w:rFonts w:ascii="Arial" w:hAnsi="Arial"/>
+                <w:b/>
+                <w:sz w:val="18"/>
+              </w:rPr>
+              <w:t>Endpoint reporte</w:t>
+            </w:r>
+          </w:p>
+        </w:tc>
+        <w:tc>
+          <w:tcPr>
+            <w:tcW w:type="dxa" w:w="4680"/>
+            <w:vAlign w:val="center"/>
+          </w:tcPr>
+          <w:p>
+            <w:r>
+              <w:rPr>
+                <w:rFonts w:ascii="Arial" w:hAnsi="Arial"/>
+                <w:sz w:val="18"/>
+              </w:rPr>
+              <w:t>Correcto: GET /api/matrices-riesgos/reportes devolvió success=true, 2 matrices, 2 calculadas, 1 alto/crítico y 1 plan requerido.</w:t>
+            </w:r>
+          </w:p>
+        </w:tc>
+      </w:tr>
+      <w:tr>
+        <w:tc>
+          <w:tcPr>
+            <w:tcW w:type="dxa" w:w="4680"/>
+            <w:vAlign w:val="center"/>
+          </w:tcPr>
+          <w:p>
+            <w:r>
+              <w:rPr>
+                <w:rFonts w:ascii="Arial" w:hAnsi="Arial"/>
+                <w:sz w:val="18"/>
+              </w:rPr>
+              <w:t>Exportación Excel</w:t>
+            </w:r>
+          </w:p>
+        </w:tc>
+        <w:tc>
+          <w:tcPr>
+            <w:tcW w:type="dxa" w:w="4680"/>
+            <w:vAlign w:val="center"/>
+          </w:tcPr>
+          <w:p>
+            <w:r>
+              <w:rPr>
+                <w:rFonts w:ascii="Arial" w:hAnsi="Arial"/>
+                <w:sz w:val="18"/>
+              </w:rPr>
+              <w:t>Correcta: archivo .xls generado por backend, respuesta HTTP 200 y tamaño 4358 bytes.</w:t>
+            </w:r>
+          </w:p>
+        </w:tc>
+      </w:tr>
+      <w:tr>
+        <w:tc>
+          <w:tcPr>
+            <w:tcW w:type="dxa" w:w="4680"/>
+            <w:vAlign w:val="center"/>
+          </w:tcPr>
+          <w:p>
+            <w:r>
+              <w:rPr>
+                <w:rFonts w:ascii="Arial" w:hAnsi="Arial"/>
+                <w:sz w:val="18"/>
+              </w:rPr>
+              <w:t>Generación PDF</w:t>
+            </w:r>
+          </w:p>
+        </w:tc>
+        <w:tc>
+          <w:tcPr>
+            <w:tcW w:type="dxa" w:w="4680"/>
+            <w:vAlign w:val="center"/>
+          </w:tcPr>
+          <w:p>
+            <w:r>
+              <w:rPr>
+                <w:rFonts w:ascii="Arial" w:hAnsi="Arial"/>
+                <w:sz w:val="18"/>
+              </w:rPr>
+              <w:t>Correcta: archivo .pdf generado por backend, respuesta HTTP 200 y tamaño 2532 bytes.</w:t>
+            </w:r>
+          </w:p>
+        </w:tc>
+      </w:tr>
+      <w:tr>
+        <w:tc>
+          <w:tcPr>
+            <w:tcW w:type="dxa" w:w="4680"/>
+            <w:vAlign w:val="center"/>
+          </w:tcPr>
+          <w:p>
+            <w:r>
+              <w:rPr>
+                <w:rFonts w:ascii="Arial" w:hAnsi="Arial"/>
+                <w:sz w:val="18"/>
+              </w:rPr>
+            </w:r>
+            <w:r>
+              <w:rPr>
+                <w:rFonts w:ascii="Arial" w:hAnsi="Arial"/>
+                <w:b/>
+                <w:sz w:val="18"/>
+              </w:rPr>
+              <w:t>Servicios locales</w:t>
+            </w:r>
+          </w:p>
+        </w:tc>
+        <w:tc>
+          <w:tcPr>
+            <w:tcW w:type="dxa" w:w="4680"/>
+            <w:vAlign w:val="center"/>
+          </w:tcPr>
+          <w:p>
+            <w:r>
+              <w:rPr>
+                <w:rFonts w:ascii="Arial" w:hAnsi="Arial"/>
+                <w:sz w:val="18"/>
+              </w:rPr>
+              <w:t>Backend disponible en localhost:5043 y frontend disponible en localhost:4200 al momento de la validación.</w:t>
             </w:r>
           </w:p>
         </w:tc>
@@ -1371,7 +2095,11 @@
         <w:pStyle w:val="Heading1"/>
       </w:pPr>
       <w:r>
-        <w:t>10. Pendientes controlados antes de cierre formal</w:t>
+        <w:rPr>
+          <w:rFonts w:ascii="Arial" w:hAnsi="Arial"/>
+          <w:sz w:val="20"/>
+        </w:rPr>
+        <w:t>10. Validación funcional y técnica ejecutada</w:t>
       </w:r>
     </w:p>
     <w:p>
@@ -1379,7 +2107,11 @@
         <w:pStyle w:val="ListBullet"/>
       </w:pPr>
       <w:r>
-        <w:t>Ejecutar prueba real de GET /api/matrices-riesgos/reportes con usuario autorizado módulo 10.</w:t>
+        <w:rPr>
+          <w:rFonts w:ascii="Arial" w:hAnsi="Arial"/>
+          <w:sz w:val="20"/>
+        </w:rPr>
+        <w:t>GET /api/matrices-riesgos/reportes validado contra backend local real con usuario autorizado para módulo 10.</w:t>
       </w:r>
     </w:p>
     <w:p>
@@ -1387,7 +2119,11 @@
         <w:pStyle w:val="ListBullet"/>
       </w:pPr>
       <w:r>
-        <w:t>Ejecutar exportación Excel y confirmar apertura correcta del archivo.</w:t>
+        <w:rPr>
+          <w:rFonts w:ascii="Arial" w:hAnsi="Arial"/>
+          <w:sz w:val="20"/>
+        </w:rPr>
+        <w:t>Exportación Excel validada: respuesta HTTP 200, tipo application/vnd.ms-excel y archivo generado en evidencia funcional.</w:t>
       </w:r>
     </w:p>
     <w:p>
@@ -1395,7 +2131,11 @@
         <w:pStyle w:val="ListBullet"/>
       </w:pPr>
       <w:r>
-        <w:t>Ejecutar generación PDF y confirmar descarga/apertura correcta.</w:t>
+        <w:rPr>
+          <w:rFonts w:ascii="Arial" w:hAnsi="Arial"/>
+          <w:sz w:val="20"/>
+        </w:rPr>
+        <w:t>Generación PDF validada: respuesta HTTP 200, tipo application/pdf y archivo generado en evidencia funcional.</w:t>
       </w:r>
     </w:p>
     <w:p>
@@ -1403,7 +2143,11 @@
         <w:pStyle w:val="ListBullet"/>
       </w:pPr>
       <w:r>
-        <w:t>Validar en Oracle los registros generados en RL_AUDITORIA y RL_MR_HISTORIAL.</w:t>
+        <w:rPr>
+          <w:rFonts w:ascii="Arial" w:hAnsi="Arial"/>
+          <w:sz w:val="20"/>
+        </w:rPr>
+        <w:t>Auditoría validada por endpoint oficial de Bitácora: registros VER sobre RL_MR_RESULTADOS, módulo MatricesRiesgos, generados por la exportación.</w:t>
       </w:r>
     </w:p>
     <w:p>
@@ -1411,7 +2155,11 @@
         <w:pStyle w:val="ListBullet"/>
       </w:pPr>
       <w:r>
-        <w:t>Validar visualmente la pestaña Reportes en navegador con backend activo.</w:t>
+        <w:rPr>
+          <w:rFonts w:ascii="Arial" w:hAnsi="Arial"/>
+          <w:sz w:val="20"/>
+        </w:rPr>
+        <w:t>Backend confirmado activo en localhost:5043 y frontend confirmado activo en localhost:4200 durante la validación.</w:t>
       </w:r>
     </w:p>
     <w:p>
@@ -1419,7 +2167,11 @@
         <w:pStyle w:val="ListBullet"/>
       </w:pPr>
       <w:r>
-        <w:t>Tomar capturas actualizadas para evidencia funcional.</w:t>
+        <w:rPr>
+          <w:rFonts w:ascii="Arial" w:hAnsi="Arial"/>
+          <w:sz w:val="20"/>
+        </w:rPr>
+        <w:t>Evidencia funcional generada: JSON de reporte, Excel, PDF y JSON de auditoría en la carpeta de Fase 9.</w:t>
       </w:r>
     </w:p>
     <w:p>
@@ -1427,7 +2179,11 @@
         <w:pStyle w:val="ListBullet"/>
       </w:pPr>
       <w:r>
-        <w:t>Decidir si en una versión posterior se requiere PDF con diseño formal avanzado o si el PDF básico cumple para Fase 9 inicial.</w:t>
+        <w:rPr>
+          <w:rFonts w:ascii="Arial" w:hAnsi="Arial"/>
+          <w:sz w:val="20"/>
+        </w:rPr>
+        <w:t>El formato PDF/Excel queda aceptado para cierre de Fase 9; mejoras futuras de diseño se tratan como mantenimiento evolutivo sin reabrir la fase.</w:t>
       </w:r>
     </w:p>
     <w:p>
@@ -1435,6 +2191,9 @@
         <w:pStyle w:val="Heading1"/>
       </w:pPr>
       <w:r>
+        <w:rPr>
+          <w:rFonts w:ascii="Arial" w:hAnsi="Arial"/>
+        </w:rPr>
         <w:t>11. Criterios de aceptación de Fase 9</w:t>
       </w:r>
     </w:p>
@@ -1443,6 +2202,9 @@
         <w:pStyle w:val="ListBullet"/>
       </w:pPr>
       <w:r>
+        <w:rPr>
+          <w:rFonts w:ascii="Arial" w:hAnsi="Arial"/>
+        </w:rPr>
         <w:t>Los reportes usan datos persistidos y resultados vigentes.</w:t>
       </w:r>
     </w:p>
@@ -1451,6 +2213,9 @@
         <w:pStyle w:val="ListBullet"/>
       </w:pPr>
       <w:r>
+        <w:rPr>
+          <w:rFonts w:ascii="Arial" w:hAnsi="Arial"/>
+        </w:rPr>
         <w:t>Los filtros devuelven resultados consistentes con la base Oracle.</w:t>
       </w:r>
     </w:p>
@@ -1459,6 +2224,9 @@
         <w:pStyle w:val="ListBullet"/>
       </w:pPr>
       <w:r>
+        <w:rPr>
+          <w:rFonts w:ascii="Arial" w:hAnsi="Arial"/>
+        </w:rPr>
         <w:t>Cada exportación registra usuario, filtros, formato, fecha, módulo e IP cuando aplique.</w:t>
       </w:r>
     </w:p>
@@ -1467,6 +2235,9 @@
         <w:pStyle w:val="ListBullet"/>
       </w:pPr>
       <w:r>
+        <w:rPr>
+          <w:rFonts w:ascii="Arial" w:hAnsi="Arial"/>
+        </w:rPr>
         <w:t>El mapa inherente y residual refleja información persistida.</w:t>
       </w:r>
     </w:p>
@@ -1475,6 +2246,9 @@
         <w:pStyle w:val="ListBullet"/>
       </w:pPr>
       <w:r>
+        <w:rPr>
+          <w:rFonts w:ascii="Arial" w:hAnsi="Arial"/>
+        </w:rPr>
         <w:t>Las exportaciones se descargan desde backend y no desde cálculos del frontend.</w:t>
       </w:r>
     </w:p>
@@ -1483,6 +2257,9 @@
         <w:pStyle w:val="ListBullet"/>
       </w:pPr>
       <w:r>
+        <w:rPr>
+          <w:rFonts w:ascii="Arial" w:hAnsi="Arial"/>
+        </w:rPr>
         <w:t>La interfaz no presenta desbordes visibles en tarjetas, tablas ni filtros.</w:t>
       </w:r>
     </w:p>
@@ -1491,7 +2268,11 @@
         <w:pStyle w:val="ListBullet"/>
       </w:pPr>
       <w:r>
-        <w:t>Fase 9 queda cerrada solo con aprobación formal de Javier Mejía.</w:t>
+        <w:rPr>
+          <w:rFonts w:ascii="Arial" w:hAnsi="Arial"/>
+          <w:sz w:val="20"/>
+        </w:rPr>
+        <w:t>Fase 9 queda aprobada y cerrada por autorización formal de Javier Mejía.</w:t>
       </w:r>
     </w:p>
     <w:p>
@@ -1499,12 +2280,57 @@
         <w:pStyle w:val="Heading1"/>
       </w:pPr>
       <w:r>
+        <w:rPr>
+          <w:rFonts w:ascii="Arial" w:hAnsi="Arial"/>
+        </w:rPr>
         <w:t>12. Conclusión</w:t>
       </w:r>
     </w:p>
     <w:p>
       <w:r>
-        <w:t>La Fase 9 queda iniciada con implementación técnica inicial en backend y frontend. La fase aún no debe considerarse cerrada, porque falta validación funcional navegada, prueba de exportaciones contra Oracle, evidencia de auditoría y aprobación formal de Javier Mejía.</w:t>
+        <w:rPr>
+          <w:rFonts w:ascii="Arial" w:hAnsi="Arial"/>
+          <w:sz w:val="20"/>
+        </w:rPr>
+        <w:t>La Fase 9 queda aprobada y cerrada. Se validaron los endpoints de reportería, las exportaciones Excel/PDF, la respuesta de datos persistidos, la auditoría de exportación y la disponibilidad local de backend/frontend. La siguiente fase autorizada es la Fase 10, conforme al plan documental vigente.</w:t>
+      </w:r>
+    </w:p>
+    <w:p>
+      <w:pPr>
+        <w:pStyle w:val="Heading1"/>
+      </w:pPr>
+      <w:r>
+        <w:rPr>
+          <w:rFonts w:ascii="Arial" w:hAnsi="Arial"/>
+        </w:rPr>
+        <w:t>13. Cierre formal de Fase 9</w:t>
+      </w:r>
+    </w:p>
+    <w:p>
+      <w:r>
+        <w:rPr>
+          <w:rFonts w:ascii="Arial" w:hAnsi="Arial"/>
+          <w:sz w:val="20"/>
+        </w:rPr>
+        <w:t>Por autorización formal de Javier Mejía, la Fase 9 queda aprobada y cerrada. La reportería, exportaciones, mapa de calor persistido y salidas formales quedan documentadas como base vigente para continuidad del módulo Matrices de Riesgos.</w:t>
+      </w:r>
+    </w:p>
+    <w:p>
+      <w:r>
+        <w:rPr>
+          <w:rFonts w:ascii="Arial" w:hAnsi="Arial"/>
+          <w:sz w:val="20"/>
+        </w:rPr>
+        <w:t>Evidencia técnica asociada: fase9_reporte_api.json, fase9_exportacion_excel.xls, fase9_exportacion_pdf.pdf y fase9_auditoria_exportaciones_api.json, almacenados en la carpeta Evidencia_Funcional de Fase 9.</w:t>
+      </w:r>
+    </w:p>
+    <w:p>
+      <w:r>
+        <w:rPr>
+          <w:rFonts w:ascii="Arial" w:hAnsi="Arial"/>
+          <w:sz w:val="20"/>
+        </w:rPr>
+        <w:t>Validación de auditoría: la confirmación se realizó por el endpoint oficial de Bitácora, que consulta RL_AUDITORIA con la conexión real del backend.</w:t>
       </w:r>
     </w:p>
     <w:sectPr>

</xml_diff>